<commit_message>
auto(daily): dev loop report 2026-06-08
</commit_message>
<xml_diff>
--- a/reports/hypothesis/2026-06-08.docx
+++ b/reports/hypothesis/2026-06-08.docx
@@ -15,7 +15,7 @@
         <w:rPr>
           <w:i/>
         </w:rPr>
-        <w:t>생성일: 2026-06-08 09:15 KST  |  표본: 측정소당 최소 2340건 / 총 11875건</w:t>
+        <w:t>생성일: 2026-06-08 14:00 KST  |  표본: 측정소당 최소 2345건 / 총 11900건</w:t>
       </w:r>
     </w:p>
     <w:p>
@@ -143,7 +143,7 @@
           </w:tcPr>
           <w:p>
             <w:r>
-              <w:t>37.450</w:t>
+              <w:t>37.441</w:t>
             </w:r>
           </w:p>
         </w:tc>
@@ -153,7 +153,7 @@
           </w:tcPr>
           <w:p>
             <w:r>
-              <w:t>34.291</w:t>
+              <w:t>34.290</w:t>
             </w:r>
           </w:p>
         </w:tc>
@@ -163,7 +163,7 @@
           </w:tcPr>
           <w:p>
             <w:r>
-              <w:t>+3.159</w:t>
+              <w:t>+3.151</w:t>
             </w:r>
           </w:p>
         </w:tc>
@@ -215,7 +215,7 @@
           </w:tcPr>
           <w:p>
             <w:r>
-              <w:t>20.883</w:t>
+              <w:t>20.882</w:t>
             </w:r>
           </w:p>
         </w:tc>
@@ -225,7 +225,7 @@
           </w:tcPr>
           <w:p>
             <w:r>
-              <w:t>17.640</w:t>
+              <w:t>17.660</w:t>
             </w:r>
           </w:p>
         </w:tc>
@@ -235,7 +235,7 @@
           </w:tcPr>
           <w:p>
             <w:r>
-              <w:t>+3.243</w:t>
+              <w:t>+3.223</w:t>
             </w:r>
           </w:p>
         </w:tc>
@@ -513,7 +513,7 @@
           </w:tcPr>
           <w:p>
             <w:r>
-              <w:t>0.481</w:t>
+              <w:t>0.482</w:t>
             </w:r>
           </w:p>
         </w:tc>
@@ -660,7 +660,7 @@
           </w:tcPr>
           <w:p>
             <w:r>
-              <w:t>31.71</w:t>
+              <w:t>31.85</w:t>
             </w:r>
           </w:p>
         </w:tc>
@@ -722,7 +722,7 @@
           </w:tcPr>
           <w:p>
             <w:r>
-              <w:t>78.09</w:t>
+              <w:t>77.97</w:t>
             </w:r>
           </w:p>
         </w:tc>
@@ -784,7 +784,7 @@
           </w:tcPr>
           <w:p>
             <w:r>
-              <w:t>11.89</w:t>
+              <w:t>11.82</w:t>
             </w:r>
           </w:p>
         </w:tc>
@@ -846,7 +846,7 @@
           </w:tcPr>
           <w:p>
             <w:r>
-              <w:t>147.77</w:t>
+              <w:t>148.66</w:t>
             </w:r>
           </w:p>
         </w:tc>
@@ -908,7 +908,7 @@
           </w:tcPr>
           <w:p>
             <w:r>
-              <w:t>70.25</w:t>
+              <w:t>69.98</w:t>
             </w:r>
           </w:p>
         </w:tc>
@@ -970,7 +970,7 @@
           </w:tcPr>
           <w:p>
             <w:r>
-              <w:t>148.58</w:t>
+              <w:t>148.97</w:t>
             </w:r>
           </w:p>
         </w:tc>
@@ -1029,7 +1029,7 @@
         <w:pStyle w:val="ListBullet"/>
       </w:pPr>
       <w:r>
-        <w:t>'산단 영향군'가 '베이스라인'보다 평균 3.24 높음 (p=0.0000, 효과크기 작음 d=0.24).</w:t>
+        <w:t>'산단 영향군'가 '베이스라인'보다 평균 3.22 높음 (p=0.0000, 효과크기 작음 d=0.24).</w:t>
       </w:r>
     </w:p>
     <w:p>

</xml_diff>